<commit_message>
docs: revise paper with academic review workflow
</commit_message>
<xml_diff>
--- a/docs/paper/final_current/农业机械学报_红枣NER_最终查看稿_期刊格式初稿.docx
+++ b/docs/paper/final_current/农业机械学报_红枣NER_最终查看稿_期刊格式初稿.docx
@@ -193,7 +193,7 @@
           <w:b w:val="0"/>
           <w:sz w:val="20"/>
         </w:rPr>
-        <w:t>命名实体识别（Named Entity Recognition，NER）旨在识别文本中具有特定意义的实体并判定其类别，是知识抽取和知识图谱构建的基础任务[2]。农业领域 NER 已有较多研究围绕病虫害识别、栽培知识抽取和作物知识图谱构建展开，通过实体级遮蔽、多特征融合、领域预训练和词典增强等方式提升农业专业文本中品种、病虫害、药剂和栽培操作等实体的识别能力[3-6]。这些研究通常需要先构建作物领域语料和实体体系，再针对专业术语边界模糊、标注数据不足或语义表征单一等问题设计模型结构。红枣栽培文本也具有相似特征，但其实体类别覆盖品种、部位、物候期、农艺操作、肥料、药剂、病虫草害和加工产品等多个生产环节，术语形态比单一病虫害文本更分散。</w:t>
+        <w:t>命名实体识别（Named Entity Recognition，NER）旨在识别文本中具有特定意义的实体并判定其类别，是知识抽取和知识图谱构建的基础任务[2]。农业领域 NER 已有较多研究围绕病虫害识别、栽培知识抽取和作物知识图谱构建展开，通过实体级遮蔽、多特征融合、领域预训练和词典增强等方式提升农业专业文本中品种、病虫害、药剂和栽培操作等实体的识别能力[3-6]。这些研究通常需要先构建作物领域语料和实体体系，再针对专业术语边界模糊、标注数据不足或语义表征单一等问题设计模型结构。与主要面向单一病虫害或单一栽培环节的实体识别任务相比，红枣栽培文本覆盖品种、部位、物候期、农艺操作、肥料、药剂、病虫草害和加工产品等多个生产环节，实体体系更分散，低频复合术语更多，对领域先验和边界判别能力提出了更高要求。</w:t>
       </w:r>
     </w:p>
     <w:p>
@@ -213,7 +213,7 @@
           <w:b w:val="0"/>
           <w:sz w:val="20"/>
         </w:rPr>
-        <w:t>红枣栽培 NER 的主要困难体现在 3 个层面。在嵌入层，通用预训练模型难以充分覆盖“桃小食心虫”“枣锈病”“金丝小枣”“中性有机肥料”等低频专业术语，领域预训练又受到可用无标注语料规模限制。在解码层，CRF 通过相邻标签转移建模局部依赖，难以直接对候选实体的起始和结束位置进行联合判断，长实体和复合术语容易出现边界偏移。在训练目标层，RJND 包含 14 个实体类别，高频部位类与低频肥料、杂草、分类类之间样本差异明显，普通交叉熵或 CRF 负对数似然容易被高频类别和易分类样本主导[23]。农业知识图谱与农业知识智能服务研究进一步表明，稳定的实体识别结果是农业技术知识组织和智能服务的基础[24-25]。近年来，茶树病虫害、作物病虫害和多模态病虫害 NER 研究不断增加，说明农业领域知识抽取任务仍具有明确应用需求和持续研究价值[26-28]。</w:t>
+        <w:t>红枣栽培 NER 的主要困难体现在 3 个层面。在嵌入层，通用预训练模型难以充分覆盖“桃小食心虫”“枣锈病”“金丝小枣”“中性有机肥料”等低频专业术语，领域预训练又受到可用无标注语料规模限制。在解码层，CRF 通过相邻标签转移建模局部依赖，难以直接对候选实体的起始和结束位置进行联合判断，长实体、并列实体和复合术语容易出现边界偏移。在训练目标层，RJND 包含 14 个实体类别，高频部位类与低频肥料、杂草、分类类之间样本差异明显，普通交叉熵或 CRF 负对数似然容易被高频类别和易分类样本主导[23]。因此，红枣栽培 NER 不仅需要上下文语义表示，还需要能够注入领域术语先验、显式区分实体内部位置并对候选实体边界进行整体判断的模型结构。农业知识图谱与农业知识智能服务研究进一步表明，稳定的实体识别结果是农业技术知识组织和智能服务的基础[24-25]。近年来，茶树病虫害、作物病虫害和多模态病虫害 NER 研究不断增加，说明农业领域知识抽取任务仍具有明确应用需求和持续研究价值[26-28]。</w:t>
       </w:r>
     </w:p>
     <w:p>
@@ -313,7 +313,7 @@
           <w:b w:val="0"/>
           <w:sz w:val="20"/>
         </w:rPr>
-        <w:t>面向红枣栽培知识图谱和智能问答应用需求，结合红枣栽培生产环节与专业书籍中的术语体系，将实体类别划分为 14 类，包括部位、农事操作、品种、时期、设备、地域、病害、药剂、产品/工艺、虫害、营养、肥料、杂草和分类。标注采用“候选实体抽取-词典匹配预标注-人工校验修正”的半自动流程，并使用 BMES 标注体系进行字符级标注，其中 B、M、E、S 分别表示实体开始、中间、结束和单字实体。</w:t>
+        <w:t>面向红枣栽培知识图谱和智能问答应用需求，结合红枣栽培生产环节与专业书籍中的术语体系，将实体类别划分为 14 类，包括部位、农事操作、品种、时期、设备、地域、病害、药剂、产品/工艺、虫害、营养、肥料、杂草和分类。标注采用“候选实体抽取-词典匹配预标注-人工校验修正”的半自动流程，并使用 BMES 标注体系进行字符级标注，其中 B、M、E、S 分别表示实体开始、中间、结束和单字实体。标注过程中依据统一的实体类别定义和边界判定规则，对机器预标注结果逐句复核；对于并列实体、复合肥料名称、病虫害全称与简称等容易产生边界分歧的样本，结合上下文语义和红枣栽培术语体系进行人工修正，以减少实体边界和类别标注不一致。</w:t>
       </w:r>
     </w:p>
     <w:p>
@@ -4451,7 +4451,7 @@
           <w:b w:val="0"/>
           <w:sz w:val="20"/>
         </w:rPr>
-        <w:t>表 3 给出 EDBP 与基线模型的对比结果。为扩大对比范围，表中除 BiLSTM-CRF 和预训练 BiLSTM-CRF 强基线外，还加入 SoftLexicon、FLAT 和 FLAT+BERT 等典型词典增强模型。所有模型均采用 RJND 数据集上随机种子 42 的测试集 F1 值。</w:t>
+        <w:t>表 3 给出 EDBP 与已完成同口径基线模型的对比结果。为扩大对比范围，表中除 BiLSTM-CRF 和预训练 BiLSTM-CRF 强基线外，还加入 SoftLexicon、FLAT 和 FLAT+BERT 等典型词典增强模型。所有模型均采用 RJND 数据集上随机种子 42 的测试集 F1 值。</w:t>
       </w:r>
     </w:p>
     <w:p>
@@ -5068,7 +5068,7 @@
           <w:b w:val="0"/>
           <w:sz w:val="20"/>
         </w:rPr>
-        <w:t>由表 3 可知，EDBP 相比 BiLSTM-CRF、BERT-wwm-ext+BiLSTM+CRF、MacBERT-base+BiLSTM+CRF、SoftLexicon、FLAT 和 FLAT+BERT 分别提升 9.86、2.95、2.80、3.41、8.38 和 8.76 个百分点。SoftLexicon 和 FLAT 类模型均引入词典或 lattice 结构，但其词典特征主要通过序列编码或 lattice 注意力间接影响实体边界；EDBP 将训练集自动词典编码为 BMES 四通道特征，并通过边界预测解码器直接建模候选片段的起止位置，因此在红枣栽培专业术语识别中取得更高 F1 值。当前未取得 LatticeLSTM 和 NFLAT 在 RJND 上同一 seed 与同一评估脚本下的结果，因此未将其纳入表 3。</w:t>
+        <w:t>由表 3 可知，在已完成的当前 RJND 同口径基线中，EDBP 相比 BiLSTM-CRF、BERT-wwm-ext+BiLSTM+CRF、MacBERT-base+BiLSTM+CRF、SoftLexicon、FLAT 和 FLAT+BERT 分别提升 9.86、2.95、2.80、3.41、8.38 和 8.76 个百分点。SoftLexicon 和 FLAT 类模型均引入词典或 lattice 结构，但其词典特征主要通过序列编码或 lattice 注意力间接影响实体边界；EDBP 将训练集自动词典编码为 BMES 四通道特征，并通过边界预测解码器直接建模候选片段的起止位置，因此在已完成对比模型中取得更高 F1 值。当前未取得 LatticeLSTM 和 NFLAT 在 RJND 上同一 seed 与同一评估脚本下的结果，因此未将其纳入表 3。</w:t>
       </w:r>
     </w:p>
     <w:p>

</xml_diff>

<commit_message>
docs: finalize paper review and pdf package
</commit_message>
<xml_diff>
--- a/docs/paper/final_current/农业机械学报_红枣NER_最终查看稿_期刊格式初稿.docx
+++ b/docs/paper/final_current/农业机械学报_红枣NER_最终查看稿_期刊格式初稿.docx
@@ -123,7 +123,7 @@
           <w:b w:val="0"/>
           <w:sz w:val="20"/>
         </w:rPr>
-        <w:t>针对红枣栽培技术文本中领域术语密集、实体类别分布不均衡和传统序列标注解码器难以全局判断实体边界等问题，提出一种基于专家词典与边界预测的红枣栽培命名实体识别方法（Expert Dictionary and Boundary Prediction，EDBP）。围绕红枣栽培品种、部位、病虫害、药剂、农事操作等关键知识单元，构建涵盖 14 个实体类别的红枣栽培命名实体识别数据集 RJND；从训练集自动抽取领域实体构建专家词典，采用 BMES 四通道结构编码词典匹配位置，将领域词典先验融合到字符语义表示中；将命名实体识别建模为片段分类任务，采用边界预测解码器对候选实体起止位置进行联合打分，并引入 Focal Loss 缓解类别不平衡对低频实体识别的影响。结果表明，EDBP 在 RJND 数据集上的 F1 值达到 88.16%，较 BiLSTM-CRF、BERT-wwm-ext+BiLSTM+CRF、MacBERT-base+BiLSTM+CRF、SoftLexicon、FLAT 和 FLAT+BERT 分别提升 9.86、2.95、2.80、3.41、8.38 和 8.76 个百分点；在 MSRA、WeiboNER、ResumeNER、Boson 和 CLUENER 公开数据集上的 F1 值分别为 95.19%±0.22%、72.27%±1.03%、96.13%±0.29%、85.60%±0.12% 和 80.06%±0.38%。研究表明，专家词典特征与边界预测解码器能够有效提升红枣栽培领域实体识别精度，可为红枣栽培知识图谱构建、农业技术智能检索和问答系统提供基础支撑。</w:t>
+        <w:t>针对红枣栽培技术文本中领域术语密集、实体类别分布不均衡和传统序列标注解码器难以全局判断实体边界等问题，提出一种基于专家词典与边界预测的红枣栽培命名实体识别方法（Expert Dictionary and Boundary Prediction，EDBP）。围绕红枣栽培品种、部位、病虫害、药剂、农事操作等关键知识单元，构建涵盖 14 个实体类别的红枣栽培命名实体识别数据集 RJND；从训练集自动抽取领域实体构建专家词典，采用 BMES 四通道结构编码词典匹配位置，将领域词典先验融合到字符语义表示中；将命名实体识别建模为片段分类任务，采用边界预测解码器对候选实体起止位置进行联合打分，并引入 Focal Loss 缓解类别不平衡对低频实体识别的影响。结果表明，在已完成的当前 RJND 同口径基线中，EDBP 在测试集上的 F1 值达到 88.16%，较 BiLSTM-CRF、BERT-wwm-ext+BiLSTM+CRF、MacBERT-base+BiLSTM+CRF、SoftLexicon、FLAT 和 FLAT+BERT 分别提升 9.86、2.95、2.80、3.41、8.38 和 8.76 个百分点；在 MSRA、WeiboNER、ResumeNER、Boson 和 CLUENER 公开数据集上的 F1 值分别为 95.19%±0.22%、72.27%±1.03%、96.13%±0.29%、85.60%±0.12% 和 80.06%±0.38%。研究表明，专家词典特征与边界预测解码器能够有效提升红枣栽培领域实体识别精度，可为红枣栽培知识图谱构建、农业技术智能检索和问答系统提供基础支撑。</w:t>
       </w:r>
     </w:p>
     <w:p>
@@ -153,7 +153,7 @@
           <w:b w:val="0"/>
           <w:sz w:val="20"/>
         </w:rPr>
-        <w:t>To address the problems of dense domain-specific terminology, imbalanced entity categories, and insufficient global boundary modeling in named entity recognition for red jujube cultivation texts, an Expert Dictionary and Boundary Prediction method, named EDBP, was proposed. First, a red jujube cultivation named entity recognition dataset, RJND, was constructed around key knowledge units such as cultivars, plant parts, diseases, pests, pesticides, and cultivation operations. The dataset contains 14 entity categories. Second, domain entities were automatically extracted from the training set to build an expert dictionary. A BMES four-channel structure was used to encode the matched positions of dictionary entries, and the resulting domain priors were fused with contextual character representations. Third, named entity recognition was formulated as a span classification task. A boundary prediction decoder was used to jointly score candidate start and end positions, and Focal Loss was introduced to reduce the influence of category imbalance on low-frequency entities. The results showed that EDBP achieved an F1 score of 88.16% on RJND, outperforming BiLSTM-CRF, BERT-wwm-ext+BiLSTM+CRF, MacBERT-base+BiLSTM+CRF, SoftLexicon, FLAT, and FLAT+BERT by 9.86, 2.95, 2.80, 3.41, 8.38, and 8.76 percentage points, respectively. On the public datasets MSRA, WeiboNER, ResumeNER, Boson, and CLUENER, EDBP achieved F1 scores of 95.19%±0.22%, 72.27%±1.03%, 96.13%±0.29%, 85.60%±0.12%, and 80.06%±0.38%, respectively. The results indicate that expert dictionary features and boundary prediction can effectively improve entity recognition accuracy in red jujube cultivation texts, providing technical support for red jujube cultivation knowledge graph construction, agricultural technology retrieval, and intelligent question answering.</w:t>
+        <w:t>To address the problems of dense domain-specific terminology, imbalanced entity categories, and insufficient global boundary modeling in named entity recognition for red jujube cultivation texts, an Expert Dictionary and Boundary Prediction method, named EDBP, was proposed. First, a red jujube cultivation named entity recognition dataset, RJND, was constructed around key knowledge units such as cultivars, plant parts, diseases, pests, pesticides, and cultivation operations. The dataset contains 14 entity categories. Second, domain entities were automatically extracted from the training set to build an expert dictionary. A BMES four-channel structure was used to encode the matched positions of dictionary entries, and the resulting domain priors were fused with contextual character representations. Third, named entity recognition was formulated as a span classification task. A boundary prediction decoder was used to jointly score candidate start and end positions, and Focal Loss was introduced to reduce the influence of category imbalance on low-frequency entities. Among the completed same-setting RJND baselines, EDBP achieved a test F1 score of 88.16%, outperforming BiLSTM-CRF, BERT-wwm-ext+BiLSTM+CRF, MacBERT-base+BiLSTM+CRF, SoftLexicon, FLAT, and FLAT+BERT by 9.86, 2.95, 2.80, 3.41, 8.38, and 8.76 percentage points, respectively. On the public datasets MSRA, WeiboNER, ResumeNER, Boson, and CLUENER, EDBP achieved F1 scores of 95.19%±0.22%, 72.27%±1.03%, 96.13%±0.29%, 85.60%±0.12%, and 80.06%±0.38%, respectively. The results indicate that expert dictionary features and boundary prediction can effectively improve entity recognition accuracy in red jujube cultivation texts, providing technical support for red jujube cultivation knowledge graph construction, agricultural technology retrieval, and intelligent question answering.</w:t>
       </w:r>
     </w:p>
     <w:p>
@@ -313,7 +313,7 @@
           <w:b w:val="0"/>
           <w:sz w:val="20"/>
         </w:rPr>
-        <w:t>面向红枣栽培知识图谱和智能问答应用需求，结合红枣栽培生产环节与专业书籍中的术语体系，将实体类别划分为 14 类，包括部位、农事操作、品种、时期、设备、地域、病害、药剂、产品/工艺、虫害、营养、肥料、杂草和分类。标注采用“候选实体抽取-词典匹配预标注-人工校验修正”的半自动流程，并使用 BMES 标注体系进行字符级标注，其中 B、M、E、S 分别表示实体开始、中间、结束和单字实体。标注过程中依据统一的实体类别定义和边界判定规则，对机器预标注结果逐句复核；对于并列实体、复合肥料名称、病虫害全称与简称等容易产生边界分歧的样本，结合上下文语义和红枣栽培术语体系进行人工修正，以减少实体边界和类别标注不一致。</w:t>
+        <w:t>面向红枣栽培知识图谱和智能问答应用需求，参考农业文本实体标注准则中面向知识图谱构建的实体类别划分和标注原则[29]，结合红枣栽培生产环节与专业书籍中的术语体系，将实体类别划分为 14 类，包括部位、农事操作、品种、时期、设备、地域、病害、药剂、产品/工艺、虫害、营养、肥料、杂草和分类。标注采用“候选实体抽取-词典匹配预标注-人工校验修正”的半自动流程，并使用 BMES 标注体系进行字符级标注，其中 B、M、E、S 分别表示实体开始、中间、结束和单字实体。标注过程中依据统一的实体类别定义和边界判定规则，对机器预标注结果逐句复核；对于并列实体、复合肥料名称、病虫害全称与简称等容易产生边界分歧的样本，结合上下文语义和红枣栽培术语体系进行人工修正，以减少实体边界和类别标注不一致。</w:t>
       </w:r>
     </w:p>
     <w:p>
@@ -3557,7 +3557,7 @@
           <w:b w:val="0"/>
           <w:sz w:val="20"/>
         </w:rPr>
-        <w:t>在实现中，边界预测解码器还引入 span 长度嵌入，用于提供候选片段长度先验；训练时支持边界平滑和 Focal Loss，当 Focal Loss 聚焦因子大于 0 时采用软标签 Focal Loss 形式优化边界分类目标。</w:t>
+        <w:t>在实现中，边界预测解码器还引入 span 长度嵌入，用于提供候选片段长度先验；训练时支持边界平滑[30]和 Focal Loss，当 Focal Loss 聚焦因子大于 0 时采用软标签 Focal Loss 形式优化边界分类目标。</w:t>
       </w:r>
     </w:p>
     <w:p>
@@ -3655,7 +3655,7 @@
           <w:b w:val="0"/>
           <w:sz w:val="20"/>
         </w:rPr>
-        <w:t>红枣栽培实体类别存在明显长尾分布，低频类别如 TAX、FER、WED 样本较少。为降低易分类样本对训练目标的主导作用，引入 Focal Loss：</w:t>
+        <w:t>红枣栽培实体类别存在明显长尾分布，低频类别如 TAX、FER、WED 样本较少。已有研究表明，NLP 序列标注和阅读理解任务中的正负样本不平衡会使训练目标被大量易分类样本主导[31]。为降低易分类样本对训练目标的主导作用，引入 Focal Loss：</w:t>
       </w:r>
     </w:p>
     <w:p>
@@ -10149,7 +10149,7 @@
           <w:b w:val="0"/>
           <w:sz w:val="20"/>
         </w:rPr>
-        <w:t>1. EDBP 在 RJND 数据集上取得 88.16% 的 F1 值，较 MacBERT-base+BiLSTM+CRF 强基线提升 2.80 个百分点，说明专家词典先验和边界预测机制能够有效提升红枣栽培实体识别精度。</w:t>
+        <w:t>1. 在已完成的当前 RJND 同口径主对比中，EDBP 取得 88.16% 的 F1 值，较 MacBERT-base+BiLSTM+CRF 强基线提升 2.80 个百分点，说明专家词典先验和边界预测机制能够有效提升红枣栽培实体识别精度。</w:t>
       </w:r>
     </w:p>
     <w:p>
@@ -10480,6 +10480,36 @@
           <w:sz w:val="20"/>
         </w:rPr>
         <w:t>[28] LIU R L, GUO X C, ZHU H M, et al. A text-speech multimodal Chinese named entity recognition model for crop diseases and pests[J]. Scientific Reports, 2025, 15: 5429. DOI: 10.1038/s41598-025-88874-9.</w:t>
+      </w:r>
+    </w:p>
+    <w:p>
+      <w:r>
+        <w:rPr>
+          <w:rFonts w:ascii="Times New Roman" w:hAnsi="Times New Roman" w:eastAsia="宋体"/>
+          <w:b w:val="0"/>
+          <w:sz w:val="20"/>
+        </w:rPr>
+        <w:t>[29] 陈晓晋, 唐球, 王耀君. 面向农业知识图谱构建的文本实体标注准则构建及应用[J]. 电子技术应用, 2023, 49(5): 1-7. DOI: 10.16157/j.issn.0258-7998.233824.</w:t>
+      </w:r>
+    </w:p>
+    <w:p>
+      <w:r>
+        <w:rPr>
+          <w:rFonts w:ascii="Times New Roman" w:hAnsi="Times New Roman" w:eastAsia="宋体"/>
+          <w:b w:val="0"/>
+          <w:sz w:val="20"/>
+        </w:rPr>
+        <w:t>[30] ZHU E W, LI J P. Boundary smoothing for named entity recognition[C]//Proceedings of the 60th Annual Meeting of the Association for Computational Linguistics. Dublin: ACL, 2022: 7096-7108. DOI: 10.18653/v1/2022.acl-long.490.</w:t>
+      </w:r>
+    </w:p>
+    <w:p>
+      <w:r>
+        <w:rPr>
+          <w:rFonts w:ascii="Times New Roman" w:hAnsi="Times New Roman" w:eastAsia="宋体"/>
+          <w:b w:val="0"/>
+          <w:sz w:val="20"/>
+        </w:rPr>
+        <w:t>[31] LI X Y, SUN X F, MENG Y X, et al. Dice loss for data-imbalanced NLP tasks[C]//Proceedings of the 58th Annual Meeting of the Association for Computational Linguistics. Online: ACL, 2020: 465-476. DOI: 10.18653/v1/2020.acl-main.45.</w:t>
       </w:r>
     </w:p>
     <w:sectPr>

</xml_diff>

<commit_message>
docs: redraw paper figures
</commit_message>
<xml_diff>
--- a/docs/paper/final_current/农业机械学报_红枣NER_最终查看稿_期刊格式初稿.docx
+++ b/docs/paper/final_current/农业机械学报_红枣NER_最终查看稿_期刊格式初稿.docx
@@ -3014,7 +3014,7 @@
       <w:r>
         <w:drawing>
           <wp:inline xmlns:a="http://schemas.openxmlformats.org/drawingml/2006/main" xmlns:pic="http://schemas.openxmlformats.org/drawingml/2006/picture">
-            <wp:extent cx="5400000" cy="2790000"/>
+            <wp:extent cx="5400000" cy="3037500"/>
             <wp:docPr id="1" name="Picture 1"/>
             <wp:cNvGraphicFramePr>
               <a:graphicFrameLocks noChangeAspect="1"/>
@@ -3035,7 +3035,7 @@
                   <pic:spPr>
                     <a:xfrm>
                       <a:off x="0" y="0"/>
-                      <a:ext cx="5400000" cy="2790000"/>
+                      <a:ext cx="5400000" cy="3037500"/>
                     </a:xfrm>
                     <a:prstGeom prst="rect"/>
                   </pic:spPr>
@@ -3364,7 +3364,7 @@
       <w:r>
         <w:drawing>
           <wp:inline xmlns:a="http://schemas.openxmlformats.org/drawingml/2006/main" xmlns:pic="http://schemas.openxmlformats.org/drawingml/2006/picture">
-            <wp:extent cx="5400000" cy="2749091"/>
+            <wp:extent cx="5400000" cy="3037500"/>
             <wp:docPr id="2" name="Picture 2"/>
             <wp:cNvGraphicFramePr>
               <a:graphicFrameLocks noChangeAspect="1"/>
@@ -3385,7 +3385,7 @@
                   <pic:spPr>
                     <a:xfrm>
                       <a:off x="0" y="0"/>
-                      <a:ext cx="5400000" cy="2749091"/>
+                      <a:ext cx="5400000" cy="3037500"/>
                     </a:xfrm>
                     <a:prstGeom prst="rect"/>
                   </pic:spPr>
@@ -3580,7 +3580,7 @@
       <w:r>
         <w:drawing>
           <wp:inline xmlns:a="http://schemas.openxmlformats.org/drawingml/2006/main" xmlns:pic="http://schemas.openxmlformats.org/drawingml/2006/picture">
-            <wp:extent cx="5400000" cy="2945455"/>
+            <wp:extent cx="5400000" cy="3037500"/>
             <wp:docPr id="3" name="Picture 3"/>
             <wp:cNvGraphicFramePr>
               <a:graphicFrameLocks noChangeAspect="1"/>
@@ -3601,7 +3601,7 @@
                   <pic:spPr>
                     <a:xfrm>
                       <a:off x="0" y="0"/>
-                      <a:ext cx="5400000" cy="2945455"/>
+                      <a:ext cx="5400000" cy="3037500"/>
                     </a:xfrm>
                     <a:prstGeom prst="rect"/>
                   </pic:spPr>
@@ -9138,7 +9138,7 @@
       <w:r>
         <w:drawing>
           <wp:inline xmlns:a="http://schemas.openxmlformats.org/drawingml/2006/main" xmlns:pic="http://schemas.openxmlformats.org/drawingml/2006/picture">
-            <wp:extent cx="5400000" cy="3060000"/>
+            <wp:extent cx="5400000" cy="3206250"/>
             <wp:docPr id="4" name="Picture 4"/>
             <wp:cNvGraphicFramePr>
               <a:graphicFrameLocks noChangeAspect="1"/>
@@ -9159,7 +9159,7 @@
                   <pic:spPr>
                     <a:xfrm>
                       <a:off x="0" y="0"/>
-                      <a:ext cx="5400000" cy="3060000"/>
+                      <a:ext cx="5400000" cy="3206250"/>
                     </a:xfrm>
                     <a:prstGeom prst="rect"/>
                   </pic:spPr>
@@ -9226,7 +9226,7 @@
       <w:r>
         <w:drawing>
           <wp:inline xmlns:a="http://schemas.openxmlformats.org/drawingml/2006/main" xmlns:pic="http://schemas.openxmlformats.org/drawingml/2006/picture">
-            <wp:extent cx="5400000" cy="2790000"/>
+            <wp:extent cx="5400000" cy="3037500"/>
             <wp:docPr id="5" name="Picture 5"/>
             <wp:cNvGraphicFramePr>
               <a:graphicFrameLocks noChangeAspect="1"/>
@@ -9247,7 +9247,7 @@
                   <pic:spPr>
                     <a:xfrm>
                       <a:off x="0" y="0"/>
-                      <a:ext cx="5400000" cy="2790000"/>
+                      <a:ext cx="5400000" cy="3037500"/>
                     </a:xfrm>
                     <a:prstGeom prst="rect"/>
                   </pic:spPr>

</xml_diff>